<commit_message>
Strengthen v4 evidence with external execution and root concordance
</commit_message>
<xml_diff>
--- a/manuscript/Plant_CellFM_v4_顶刊证据主文.docx
+++ b/manuscript/Plant_CellFM_v4_顶刊证据主文.docx
@@ -97,7 +97,7 @@
           <w:sz w:val="20"/>
           <w:szCs w:val="20"/>
         </w:rPr>
-        <w:t xml:space="preserve">在嵌套严格留物种方案中，目标物种标签不参与模型拟合、候选规则选择或校准。v17 主分析在全部 3,964 个细胞上得到 39.96% 精确全细胞准确率；源标签覆盖率为 55.90%，在可覆盖标签子集中的准确率为 71.48%、macro-F1 为 0.2817。为避免将 unknown、unknow 和 unannotated 一类非身份标签误作生物学真值，我们进一步以 v18 建立显式身份伴随队列：从 3,964 个公开标签细胞中保留 2,324 个身份明确细胞，并将 1,640 个不具信息的标签固定为审计项。目标物种少样本适配显示稳定的剂量响应，在每物种 8、16、32 和 64 个标注支持细胞时，10 次独立抽样的查询全细胞准确率分别为 59.21%、67.34%、72.30% 和 75.89%，且支持细胞从不进入查询评分。我们还给出匹配冻结检查点比较、拟南芥根系 marker 候选资源、源数据表、图表审计和可执行发布资产。Plant-CellFM 的核心贡献不是以单一高分取代复杂的植物标签空间，而是提供一条能区分开放集迁移、少样本适配和部署推断的证据优先路线。</w:t>
+        <w:t xml:space="preserve">在嵌套严格留物种方案中，目标物种标签不参与模型拟合、候选规则选择或校准。v17 主分析在全部 3,964 个细胞上得到 39.96% 精确全细胞准确率；源标签覆盖率为 55.90%，在可覆盖标签子集中的准确率为 71.48%、macro-F1 为 0.2817。为避免将 unknown、unknow 和 unannotated 一类非身份标签误作生物学真值，我们进一步以 v18 建立显式身份伴随队列：从 3,964 个公开标签细胞中保留 2,324 个身份明确细胞，并将 1,640 个不具信息的标签固定为审计项。目标物种少样本适配显示稳定的剂量响应，在每物种 8、16、32 和 64 个标注支持细胞时，10 次独立抽样的查询全细胞准确率分别为 59.21%、67.34%、72.30% 和 75.89%，且支持细胞从不进入查询评分。我们还给出匹配冻结检查点比较、拟南芥根系 marker 候选资源及其预定义文献锚点一致性、源数据表、图表审计和可执行发布资产。Plant-CellFM 的核心贡献不是以单一高分取代复杂的植物标签空间，而是提供一条能区分开放集迁移、少样本适配和部署推断的证据优先路线。</w:t>
       </w:r>
     </w:p>
     <w:p>
@@ -1104,7 +1104,7 @@
           <w:sz w:val="20"/>
           <w:szCs w:val="20"/>
         </w:rPr>
-        <w:t xml:space="preserve">值得注意的是，留物种仍是三种匹配协议中提升幅度最小、也是最具生物学挑战的一项（扩展数据图 3c）。这种结果既展示冻结版本迭代的可重复收益，也使跨物种难点保持可见。外部比较采用同一证据准则：余弦质心和 Seurat label transfer 各有已记录的独立结果；scPlantLLM 已完成官方代码、权重与输入契约的准备，但尚缺少与严格 3,964 细胞完全匹配的原始输入矩阵和官方预测；scPlantAnnotate 需要经认证或官方导出的批量预测。本文因此不构造貌似公平但协议不闭合的第三方排名表，也不宣称对上述工具的数值优越性（表 S12）。</w:t>
+        <w:t xml:space="preserve">值得注意的是，留物种仍是三种匹配协议中提升幅度最小、也是最具生物学挑战的一项（扩展数据图 3c）。这种结果既展示冻结版本迭代的可重复收益，也使跨物种难点保持可见。外部比较采用同一证据准则：余弦质心和 Seurat label transfer 各有已记录的独立结果；scPlantLLM 官方 checkpoint 已在 CUDA 上完成实际加载与运行，在其官方预处理 train/test chunk 的分层 256/256 细胞冻结表示-余弦质心探针中得到 83.98% 准确率和 0.8408 macro-F1，且 state dict 缺失和意外键均为 0。该记录证明官方权重和推理路径可复现，但它既不是官方分类头复现，也不与严格 3,964 细胞 v17 共享原始输入、标签空间、split 或开放集计分，因此不能作为两模型的数值排名。scPlantAnnotate 仍需要经认证或官方导出的批量预测。本文因此不构造貌似公平但协议不闭合的第三方排名表，也不宣称对上述工具的数值优越性（表 S12）。</w:t>
       </w:r>
     </w:p>
     <w:p>
@@ -1213,7 +1213,7 @@
           <w:sz w:val="20"/>
           <w:szCs w:val="20"/>
         </w:rPr>
-        <w:t xml:space="preserve">全部 260 条候选记录及其分数、检测率、效应量和身份归属由表 S13 提供。这种输出将模型注释与后续实验设计、图谱策展和文献核对相连：研究者可以从身份层级进入候选基因，也可以从基因效应与检测分离度反查优先级。该案例严格定位为公共数据上的计算资源，候选 marker 代表可检验假设而非湿实验验证结论。这样，模型的生物学价值由可复查的候选证据支撑，而不依赖未完成的实验性叙述。</w:t>
+        <w:t xml:space="preserve">全部 260 条候选记录及其分数、检测率、效应量和身份归属由表 S13 提供。为避免候选列表仅依赖内部排序，我们在查看候选排名前从拟南芥根系原始单细胞文献固定 6 个经典 marker-身份锚点；其中韧皮部 APL（AT1G79430）、内皮层 CASP1（AT2G36100）和木质部 MYB46（AT5G12870）分别在匹配身份程序的前 4、7 和 12 位被回收（扩展数据图 4，表 S16）。其余三个预定义锚点同样保留在审计表中而未被隐去，因而该结果是可复核的 3/6 文献一致性记录，而不是事后挑选的成功案例。这种输出将模型注释与后续实验设计、图谱策展和文献核对相连：研究者可以从身份层级进入候选基因，也可以从基因效应与检测分离度反查优先级。该案例严格定位为公共数据上的计算资源，文献一致性支持身份命名的生物学合理性，但候选 marker 仍代表可检验假设而非独立矩阵复现或湿实验验证结论。</w:t>
       </w:r>
     </w:p>
     <w:p>
@@ -1562,6 +1562,21 @@
     </w:p>
     <w:p>
       <w:pPr>
+        <w:spacing w:after="125" w:line="296"/>
+        <w:jc w:val="both"/>
+      </w:pPr>
+      <w:r>
+        <w:rPr>
+          <w:rFonts w:ascii="Microsoft YaHei" w:cs="Microsoft YaHei" w:eastAsia="Microsoft YaHei" w:hAnsi="Microsoft YaHei"/>
+          <w:color w:val="18242E"/>
+          <w:sz w:val="20"/>
+          <w:szCs w:val="20"/>
+        </w:rPr>
+        <w:t xml:space="preserve">扩展数据图 4 | 拟南芥根系候选 marker 的预定义文献锚点一致性。 a，来自根系单细胞原始文献的 6 个经典 marker 在其匹配身份 top-20 候选程序中的完整查找结果；实心点为被回收的位点，叉号为未进入存储 top-20 列表的位点。b，已回收的 CASP1、APL 与 MYB46 的检出率分离度及候选排名。该分析使用预先固定的文献锚点，支持公共数据候选资源的生物学合理性；不构成独立表达矩阵复现或湿实验验证。</w:t>
+      </w:r>
+    </w:p>
+    <w:p>
+      <w:pPr>
         <w:pStyle w:val="Heading1"/>
         <w:spacing w:after="120" w:before="280"/>
       </w:pPr>
@@ -1606,6 +1621,7 @@
         </w:rPr>
         <w:t xml:space="preserve">python scripts/run_revision_v18_identity_curated_strict.py
 python scripts/run_revision_v11_fewshot_adapter_benchmark.py
+python scripts/build_v4_root_literature_concordance.py
 python scripts/render_v4_top_journal_figures.py
 python scripts/write_submission_v4_supplementary_tables.py
 python scripts/audit_v4_submission_figure_suite.py</w:t>
@@ -1746,6 +1762,36 @@
           <w:szCs w:val="20"/>
         </w:rPr>
         <w:t xml:space="preserve">Lotfollahi, M. et al. Nicheformer: a foundation model for single-cell and spatial omics. Nature Methods 22, 2525-2538 (2025). https://doi.org/10.1038/s41592-025-02814-z</w:t>
+      </w:r>
+    </w:p>
+    <w:p>
+      <w:pPr>
+        <w:spacing w:after="90" w:line="275"/>
+        <w:jc w:val="both"/>
+      </w:pPr>
+      <w:r>
+        <w:rPr>
+          <w:rFonts w:ascii="Microsoft YaHei" w:cs="Microsoft YaHei" w:eastAsia="Microsoft YaHei" w:hAnsi="Microsoft YaHei"/>
+          <w:color w:val="18242E"/>
+          <w:sz w:val="20"/>
+          <w:szCs w:val="20"/>
+        </w:rPr>
+        <w:t xml:space="preserve">Jean-Baptiste, K. et al. Dynamics of Gene Expression in Single Root Cells of Arabidopsis thaliana. Plant Cell 31, 993-1011 (2019). https://pmc.ncbi.nlm.nih.gov/articles/PMC8516002/</w:t>
+      </w:r>
+    </w:p>
+    <w:p>
+      <w:pPr>
+        <w:spacing w:after="90" w:line="275"/>
+        <w:jc w:val="both"/>
+      </w:pPr>
+      <w:r>
+        <w:rPr>
+          <w:rFonts w:ascii="Microsoft YaHei" w:cs="Microsoft YaHei" w:eastAsia="Microsoft YaHei" w:hAnsi="Microsoft YaHei"/>
+          <w:color w:val="18242E"/>
+          <w:sz w:val="20"/>
+          <w:szCs w:val="20"/>
+        </w:rPr>
+        <w:t xml:space="preserve">Shahan, R. et al. A single cell Arabidopsis root atlas reveals developmental trajectories in wild-type and cell identity mutants. Developmental Cell 57, 543-560.e9 (2022). https://doi.org/10.1016/j.devcel.2022.01.008</w:t>
       </w:r>
     </w:p>
     <w:p>

</xml_diff>

<commit_message>
Add external root evidence and submission visuals
</commit_message>
<xml_diff>
--- a/manuscript/Plant_CellFM_v4_顶刊证据主文.docx
+++ b/manuscript/Plant_CellFM_v4_顶刊证据主文.docx
@@ -97,7 +97,7 @@
           <w:sz w:val="20"/>
           <w:szCs w:val="20"/>
         </w:rPr>
-        <w:t xml:space="preserve">在嵌套严格留物种方案中，目标物种标签不参与模型拟合、候选规则选择或校准。v17 主分析在全部 3,964 个细胞上得到 39.96% 精确全细胞准确率；源标签覆盖率为 55.90%，在可覆盖标签子集中的准确率为 71.48%、macro-F1 为 0.2817。为避免将 unknown、unknow 和 unannotated 一类非身份标签误作生物学真值，我们进一步以 v18 建立显式身份伴随队列：从 3,964 个公开标签细胞中保留 2,324 个身份明确细胞，并将 1,640 个不具信息的标签固定为审计项。目标物种少样本适配显示稳定的剂量响应，在每物种 8、16、32 和 64 个标注支持细胞时，10 次独立抽样的查询全细胞准确率分别为 59.21%、67.34%、72.30% 和 75.89%，且支持细胞从不进入查询评分。我们还给出匹配冻结检查点比较、拟南芥根系 marker 候选资源及其预定义文献锚点一致性、源数据表、图表审计和可执行发布资产。Plant-CellFM 的核心贡献不是以单一高分取代复杂的植物标签空间，而是提供一条能区分开放集迁移、少样本适配和部署推断的证据优先路线。</w:t>
+        <w:t xml:space="preserve">在嵌套严格留物种方案中，目标物种标签不参与模型拟合、候选规则选择或校准。v17 主分析在全部 3,964 个细胞上得到 39.96% 精确全细胞准确率；源标签覆盖率为 55.90%，在可覆盖标签子集中的准确率为 71.48%、macro-F1 为 0.2817。为避免将 unknown、unknow 和 unannotated 一类非身份标签误作生物学真值，我们进一步以 v18 建立显式身份伴随队列：从 3,964 个公开标签细胞中保留 2,324 个身份明确细胞，并将 1,640 个不具信息的标签固定为审计项。目标物种少样本适配显示稳定的剂量响应，在每物种 8、16、32 和 64 个标注支持细胞时，10 次独立抽样的查询全细胞准确率分别为 59.21%、67.34%、72.30% 和 75.89%，且支持细胞从不进入查询评分。我们还给出匹配冻结检查点比较、拟南芥根系 marker 候选资源及其预定义文献锚点一致性，以及对不在冻结 v4 语料 profile 中的无标签外部根系矩阵执行的盲推理与 marker 一致性审计。Plant-CellFM 的核心贡献不是以单一高分取代复杂的植物标签空间，而是提供一条能区分开放集迁移、少样本适配和部署推断的证据优先路线。</w:t>
       </w:r>
     </w:p>
     <w:p>
@@ -782,6 +782,107 @@
                 <w:sz w:val="17"/>
                 <w:szCs w:val="17"/>
               </w:rPr>
+              <w:t xml:space="preserve">外部无标签根系盲推理</w:t>
+            </w:r>
+          </w:p>
+        </w:tc>
+        <w:tc>
+          <w:tcPr>
+            <w:tcW w:type="dxa" w:w="1700"/>
+            <w:tcBorders>
+              <w:top w:val="single" w:color="D8E0E4" w:sz="1"/>
+              <w:left w:val="single" w:color="D8E0E4" w:sz="1"/>
+              <w:bottom w:val="single" w:color="D8E0E4" w:sz="1"/>
+              <w:right w:val="single" w:color="D8E0E4" w:sz="1"/>
+            </w:tcBorders>
+            <w:tcMar>
+              <w:top w:type="dxa" w:w="90"/>
+              <w:left w:type="dxa" w:w="100"/>
+              <w:bottom w:type="dxa" w:w="90"/>
+              <w:right w:type="dxa" w:w="100"/>
+            </w:tcMar>
+          </w:tcPr>
+          <w:p>
+            <w:pPr>
+              <w:spacing w:after="0"/>
+            </w:pPr>
+            <w:r>
+              <w:rPr>
+                <w:rFonts w:ascii="Microsoft YaHei" w:cs="Microsoft YaHei" w:eastAsia="Microsoft YaHei" w:hAnsi="Microsoft YaHei"/>
+                <w:b w:val="false"/>
+                <w:bCs w:val="false"/>
+                <w:color w:val="18242E"/>
+                <w:sz w:val="17"/>
+                <w:szCs w:val="17"/>
+              </w:rPr>
+              <w:t xml:space="preserve">6,566 细胞；5/6 marker 顶位一致</w:t>
+            </w:r>
+          </w:p>
+        </w:tc>
+        <w:tc>
+          <w:tcPr>
+            <w:tcW w:type="dxa" w:w="4826"/>
+            <w:tcBorders>
+              <w:top w:val="single" w:color="D8E0E4" w:sz="1"/>
+              <w:left w:val="single" w:color="D8E0E4" w:sz="1"/>
+              <w:bottom w:val="single" w:color="D8E0E4" w:sz="1"/>
+              <w:right w:val="single" w:color="D8E0E4" w:sz="1"/>
+            </w:tcBorders>
+            <w:tcMar>
+              <w:top w:type="dxa" w:w="90"/>
+              <w:left w:type="dxa" w:w="100"/>
+              <w:bottom w:type="dxa" w:w="90"/>
+              <w:right w:type="dxa" w:w="100"/>
+            </w:tcMar>
+          </w:tcPr>
+          <w:p>
+            <w:pPr>
+              <w:spacing w:after="0"/>
+            </w:pPr>
+            <w:r>
+              <w:rPr>
+                <w:rFonts w:ascii="Microsoft YaHei" w:cs="Microsoft YaHei" w:eastAsia="Microsoft YaHei" w:hAnsi="Microsoft YaHei"/>
+                <w:b w:val="false"/>
+                <w:bCs w:val="false"/>
+                <w:color w:val="18242E"/>
+                <w:sz w:val="17"/>
+                <w:szCs w:val="17"/>
+              </w:rPr>
+              <w:t xml:space="preserve">GSE152766 / GSM4626007 不在冻结 v4 profile；为 marker 一致性审计，不是外部准确率。</w:t>
+            </w:r>
+          </w:p>
+        </w:tc>
+      </w:tr>
+      <w:tr>
+        <w:tc>
+          <w:tcPr>
+            <w:tcW w:type="dxa" w:w="2500"/>
+            <w:tcBorders>
+              <w:top w:val="single" w:color="D8E0E4" w:sz="1"/>
+              <w:left w:val="single" w:color="D8E0E4" w:sz="1"/>
+              <w:bottom w:val="single" w:color="D8E0E4" w:sz="1"/>
+              <w:right w:val="single" w:color="D8E0E4" w:sz="1"/>
+            </w:tcBorders>
+            <w:tcMar>
+              <w:top w:type="dxa" w:w="90"/>
+              <w:left w:type="dxa" w:w="100"/>
+              <w:bottom w:type="dxa" w:w="90"/>
+              <w:right w:type="dxa" w:w="100"/>
+            </w:tcMar>
+          </w:tcPr>
+          <w:p>
+            <w:pPr>
+              <w:spacing w:after="0"/>
+            </w:pPr>
+            <w:r>
+              <w:rPr>
+                <w:rFonts w:ascii="Microsoft YaHei" w:cs="Microsoft YaHei" w:eastAsia="Microsoft YaHei" w:hAnsi="Microsoft YaHei"/>
+                <w:b w:val="false"/>
+                <w:bCs w:val="false"/>
+                <w:color w:val="18242E"/>
+                <w:sz w:val="17"/>
+                <w:szCs w:val="17"/>
+              </w:rPr>
               <w:t xml:space="preserve">运行时全词表注释头</w:t>
             </w:r>
           </w:p>
@@ -1151,7 +1252,7 @@
           <w:sz w:val="20"/>
           <w:szCs w:val="20"/>
         </w:rPr>
-        <w:t xml:space="preserve">查询全细胞准确率随支持预算单调提升：8 个支持细胞时为 59.21%，16 个时为 67.34%，32 个时为 72.30%，64 个时为 75.89%（图 3b；表 S6）。图 3b 同时呈现每次独立抽样的原始点、均值和标准差，避免把单次幸运抽样当作稳定效果。查询 macro-F1 也从 0.2195 提升至 0.4619（图 3c），说明提升并非仅由大类标签驱动。按物种展开的矩阵显示，适配增益在不同物种间并不一致，但在全部预算上保持可见的支持响应（图 3d；表 S7）。</w:t>
+        <w:t xml:space="preserve">查询全细胞准确率随支持预算单调提升：8 个支持细胞时为 59.21%，16 个时为 67.34%，32 个时为 72.30%，64 个时为 75.89%（图 3b；表 S8）。图 3b 同时呈现每次独立抽样的原始点、均值和标准差，避免把单次幸运抽样当作稳定效果。查询 macro-F1 也从 0.2195 提升至 0.4619（图 3c），说明提升并非仅由大类标签驱动。按物种展开的矩阵显示，适配增益在不同物种间并不一致，但在全部预算上保持可见的支持响应（图 3d；表 S10）。</w:t>
       </w:r>
     </w:p>
     <w:p>
@@ -1230,54 +1331,37 @@
           <w:sz w:val="24"/>
           <w:szCs w:val="24"/>
         </w:rPr>
-        <w:t xml:space="preserve">7. 从严格基准到部署服务的每一层输出均保留独立报告边界</w:t>
-      </w:r>
-    </w:p>
-    <w:p>
-      <w:pPr>
-        <w:spacing w:after="125" w:line="296"/>
-        <w:jc w:val="both"/>
-      </w:pPr>
-      <w:r>
-        <w:rPr>
-          <w:rFonts w:ascii="Microsoft YaHei" w:cs="Microsoft YaHei" w:eastAsia="Microsoft YaHei" w:hAnsi="Microsoft YaHei"/>
-          <w:color w:val="18242E"/>
-          <w:sz w:val="20"/>
-          <w:szCs w:val="20"/>
-        </w:rPr>
-        <w:t xml:space="preserve">Plant-CellFM 同时提供运行时全词表注释头。该模式在已经具备部署标签词表和训练分类器的前提下运行，因而不等价于严格零样本跨物种迁移。全词表运行时分析在相同对齐细胞上的全细胞准确率为 66.25%，作为部署可用性记录独立保存。模型卡、补充表 S2 和图表审计均将它明确标记为 runtime 分析，防止被误读为 v17 的严格性能。</w:t>
-      </w:r>
-    </w:p>
-    <w:p>
-      <w:pPr>
-        <w:spacing w:after="125" w:line="296"/>
-        <w:jc w:val="both"/>
-      </w:pPr>
-      <w:r>
-        <w:rPr>
-          <w:rFonts w:ascii="Microsoft YaHei" w:cs="Microsoft YaHei" w:eastAsia="Microsoft YaHei" w:hAnsi="Microsoft YaHei"/>
-          <w:color w:val="18242E"/>
-          <w:sz w:val="20"/>
-          <w:szCs w:val="20"/>
-        </w:rPr>
-        <w:t xml:space="preserve">这一分层报告建立了从图谱证据到服务接口的闭环：共享嵌入支持跨数据检索，严格评估刻画开放集风险，少样本适配提供新物种进入策略，运行时头服务已有标签体系的部署，marker 候选资源支持实验与策展。它们使用同一项目代码和数据契约，但不共享不该共享的性能标签。</w:t>
-      </w:r>
-    </w:p>
-    <w:p>
-      <w:pPr>
-        <w:pStyle w:val="Heading1"/>
-        <w:spacing w:after="120" w:before="280"/>
-      </w:pPr>
-      <w:r>
-        <w:rPr>
-          <w:rFonts w:ascii="Microsoft YaHei" w:cs="Microsoft YaHei" w:eastAsia="Microsoft YaHei" w:hAnsi="Microsoft YaHei"/>
-          <w:b/>
-          <w:bCs/>
-          <w:color w:val="18242E"/>
-          <w:sz w:val="29"/>
-          <w:szCs w:val="29"/>
-        </w:rPr>
-        <w:t xml:space="preserve">方法</w:t>
+        <w:t xml:space="preserve">7. 无标签外部根系矩阵支持盲推理与预定义 marker 的一致性核对，而不替代准确率验证</w:t>
+      </w:r>
+    </w:p>
+    <w:p>
+      <w:pPr>
+        <w:spacing w:after="125" w:line="296"/>
+        <w:jc w:val="both"/>
+      </w:pPr>
+      <w:r>
+        <w:rPr>
+          <w:rFonts w:ascii="Microsoft YaHei" w:cs="Microsoft YaHei" w:eastAsia="Microsoft YaHei" w:hAnsi="Microsoft YaHei"/>
+          <w:color w:val="18242E"/>
+          <w:sz w:val="20"/>
+          <w:szCs w:val="20"/>
+        </w:rPr>
+        <w:t xml:space="preserve">为了使根系案例不止停留在同一候选资源内部的文献回查，我们从 GEO 获取拟南芥 GSE152766 的 GSM4626007 根系 spliced-count 矩阵。该输入含 6,566 个细胞、25,171 个 TAIR10 基因标识符，且在当前冻结 v4 语料 profile 的 9 个数据集 ID 中不存在。输入矩阵不含专家细胞类型标签，因此它被预先定义为盲推理案例：使用冻结 epoch-4 检查点进行 CUDA 注释，不训练、不调参，也不生成外部准确率。模型为全部细胞输出 13 个状态及置信度，其中侧根冠、皮层和中柱为主要预测群，Unknow 状态仍以 8.07% 的比例保留在输出中（扩展数据图 5a,b；表 S17）。</w:t>
+      </w:r>
+    </w:p>
+    <w:p>
+      <w:pPr>
+        <w:spacing w:after="125" w:line="296"/>
+        <w:jc w:val="both"/>
+      </w:pPr>
+      <w:r>
+        <w:rPr>
+          <w:rFonts w:ascii="Microsoft YaHei" w:cs="Microsoft YaHei" w:eastAsia="Microsoft YaHei" w:hAnsi="Microsoft YaHei"/>
+          <w:color w:val="18242E"/>
+          <w:sz w:val="20"/>
+          <w:szCs w:val="20"/>
+        </w:rPr>
+        <w:t xml:space="preserve">在读取外部表达矩阵之前，我们沿用根系原始文献中固定的 6 个 marker—身份锚点，并以与注释流程一致的每细胞 10,000 归一化与 log1p 转换计算预测群内外分离度。COBL9（根毛）、GL2（非根毛）、CASP1（内皮层）、APL（韧皮部）和 MYB46（木质部）均在相应预测群中同时取得 13 个输出状态中的最高平均表达和最高检出率；WER 在非根毛预测群中保持正向分离，但平均表达和检出率排名分别为第 4 和第 3（扩展数据图 5c；表 S17）。APL 所在韧皮部预测群只有 4 个细胞，图中和源数据表中明确保留该分母。该结果提供了“模型分组与独立外部表达程序相一致”的可复算证据，而不是把 marker 一致性改写为真值准确率、独立实验验证或与第三方模型的数值排名。</w:t>
       </w:r>
     </w:p>
     <w:p>
@@ -1294,22 +1378,54 @@
           <w:sz w:val="24"/>
           <w:szCs w:val="24"/>
         </w:rPr>
-        <w:t xml:space="preserve">语料 profile 与严格评估面板</w:t>
-      </w:r>
-    </w:p>
-    <w:p>
-      <w:pPr>
-        <w:spacing w:after="125" w:line="296"/>
-        <w:jc w:val="both"/>
-      </w:pPr>
-      <w:r>
-        <w:rPr>
-          <w:rFonts w:ascii="Microsoft YaHei" w:cs="Microsoft YaHei" w:eastAsia="Microsoft YaHei" w:hAnsi="Microsoft YaHei"/>
-          <w:color w:val="18242E"/>
-          <w:sz w:val="20"/>
-          <w:szCs w:val="20"/>
-        </w:rPr>
-        <w:t xml:space="preserve">使用 H5AD profile 工作流统计冻结语料中的物种、数据集、样本、组织、基因和原始细胞标签，并导出 TSV 源表。严格评估以冻结嵌入、观测元数据和逐细胞预测记录为输入，将 3,964 个已对齐细胞按 8 个物种进行外层留出。严格面板中的物种数大于当前冻结语料 profile 中的物种数，代表评估的跨物种压力范围，而不代表训练语料对所有物种均有同等覆盖。</w:t>
+        <w:t xml:space="preserve">8. 从严格基准到部署服务的每一层输出均保留独立报告边界</w:t>
+      </w:r>
+    </w:p>
+    <w:p>
+      <w:pPr>
+        <w:spacing w:after="125" w:line="296"/>
+        <w:jc w:val="both"/>
+      </w:pPr>
+      <w:r>
+        <w:rPr>
+          <w:rFonts w:ascii="Microsoft YaHei" w:cs="Microsoft YaHei" w:eastAsia="Microsoft YaHei" w:hAnsi="Microsoft YaHei"/>
+          <w:color w:val="18242E"/>
+          <w:sz w:val="20"/>
+          <w:szCs w:val="20"/>
+        </w:rPr>
+        <w:t xml:space="preserve">Plant-CellFM 同时提供运行时全词表注释头。该模式在已经具备部署标签词表和训练分类器的前提下运行，因而不等价于严格零样本跨物种迁移。全词表运行时分析在相同对齐细胞上的全细胞准确率为 66.25%，作为部署可用性记录独立保存。模型卡、补充表 S2 和图表审计均将它明确标记为 runtime 分析，防止被误读为 v17 的严格性能。</w:t>
+      </w:r>
+    </w:p>
+    <w:p>
+      <w:pPr>
+        <w:spacing w:after="125" w:line="296"/>
+        <w:jc w:val="both"/>
+      </w:pPr>
+      <w:r>
+        <w:rPr>
+          <w:rFonts w:ascii="Microsoft YaHei" w:cs="Microsoft YaHei" w:eastAsia="Microsoft YaHei" w:hAnsi="Microsoft YaHei"/>
+          <w:color w:val="18242E"/>
+          <w:sz w:val="20"/>
+          <w:szCs w:val="20"/>
+        </w:rPr>
+        <w:t xml:space="preserve">这一分层报告建立了从图谱证据到服务接口的闭环：共享嵌入支持跨数据检索，严格评估刻画开放集风险，少样本适配提供新物种进入策略，运行时头服务已有标签体系的部署，marker 候选资源支持实验与策展。它们使用同一项目代码和数据契约，但不共享不该共享的性能标签。</w:t>
+      </w:r>
+    </w:p>
+    <w:p>
+      <w:pPr>
+        <w:pStyle w:val="Heading1"/>
+        <w:spacing w:after="120" w:before="280"/>
+      </w:pPr>
+      <w:r>
+        <w:rPr>
+          <w:rFonts w:ascii="Microsoft YaHei" w:cs="Microsoft YaHei" w:eastAsia="Microsoft YaHei" w:hAnsi="Microsoft YaHei"/>
+          <w:b/>
+          <w:bCs/>
+          <w:color w:val="18242E"/>
+          <w:sz w:val="29"/>
+          <w:szCs w:val="29"/>
+        </w:rPr>
+        <w:t xml:space="preserve">方法</w:t>
       </w:r>
     </w:p>
     <w:p>
@@ -1326,22 +1442,22 @@
           <w:sz w:val="24"/>
           <w:szCs w:val="24"/>
         </w:rPr>
-        <w:t xml:space="preserve">模型、基因迁移与输出接口</w:t>
-      </w:r>
-    </w:p>
-    <w:p>
-      <w:pPr>
-        <w:spacing w:after="125" w:line="296"/>
-        <w:jc w:val="both"/>
-      </w:pPr>
-      <w:r>
-        <w:rPr>
-          <w:rFonts w:ascii="Microsoft YaHei" w:cs="Microsoft YaHei" w:eastAsia="Microsoft YaHei" w:hAnsi="Microsoft YaHei"/>
-          <w:color w:val="18242E"/>
-          <w:sz w:val="20"/>
-          <w:szCs w:val="20"/>
-        </w:rPr>
-        <w:t xml:space="preserve">模型使用四层表达编码器产生 256 维细胞嵌入，支持 LoRA 适配和已登记适配器解析。数据输入为 cells × genes 矩阵。精确基因标识符首先与检查点词表对齐；需要跨参考基因组时，调用显式同源基因映射契约。层级注释路径、marker 候选排序和运行时元数据作为模型服务输出。模型能力、已验证范围和未完成比较在 release_metadata/plant_cellfm_model_card_v4.json 中分层记录。</w:t>
+        <w:t xml:space="preserve">语料 profile 与严格评估面板</w:t>
+      </w:r>
+    </w:p>
+    <w:p>
+      <w:pPr>
+        <w:spacing w:after="125" w:line="296"/>
+        <w:jc w:val="both"/>
+      </w:pPr>
+      <w:r>
+        <w:rPr>
+          <w:rFonts w:ascii="Microsoft YaHei" w:cs="Microsoft YaHei" w:eastAsia="Microsoft YaHei" w:hAnsi="Microsoft YaHei"/>
+          <w:color w:val="18242E"/>
+          <w:sz w:val="20"/>
+          <w:szCs w:val="20"/>
+        </w:rPr>
+        <w:t xml:space="preserve">使用 H5AD profile 工作流统计冻结语料中的物种、数据集、样本、组织、基因和原始细胞标签，并导出 TSV 源表。严格评估以冻结嵌入、观测元数据和逐细胞预测记录为输入，将 3,964 个已对齐细胞按 8 个物种进行外层留出。严格面板中的物种数大于当前冻结语料 profile 中的物种数，代表评估的跨物种压力范围，而不代表训练语料对所有物种均有同等覆盖。</w:t>
       </w:r>
     </w:p>
     <w:p>
@@ -1358,37 +1474,22 @@
           <w:sz w:val="24"/>
           <w:szCs w:val="24"/>
         </w:rPr>
-        <w:t xml:space="preserve">嵌套严格留物种评估与开放集指标</w:t>
-      </w:r>
-    </w:p>
-    <w:p>
-      <w:pPr>
-        <w:spacing w:after="125" w:line="296"/>
-        <w:jc w:val="both"/>
-      </w:pPr>
-      <w:r>
-        <w:rPr>
-          <w:rFonts w:ascii="Microsoft YaHei" w:cs="Microsoft YaHei" w:eastAsia="Microsoft YaHei" w:hAnsi="Microsoft YaHei"/>
-          <w:color w:val="18242E"/>
-          <w:sz w:val="20"/>
-          <w:szCs w:val="20"/>
-        </w:rPr>
-        <w:t xml:space="preserve">每个外层留出物种只在源物种上执行候选解码规则的内层留物种选择。最终候选规则应用于从未参与拟合或选择的目标物种。精确全细胞准确率以所有留出细胞为分母；标签覆盖率定义为目标真值标签存在于源训练标签集合中的细胞比例；条件准确率和 macro-F1 仅在可覆盖标签子集上计算。v17 同时保存候选规则排名、被选规则、逐物种汇总和逐细胞预测。</w:t>
-      </w:r>
-    </w:p>
-    <w:p>
-      <w:pPr>
-        <w:spacing w:after="125" w:line="296"/>
-        <w:jc w:val="both"/>
-      </w:pPr>
-      <w:r>
-        <w:rPr>
-          <w:rFonts w:ascii="Microsoft YaHei" w:cs="Microsoft YaHei" w:eastAsia="Microsoft YaHei" w:hAnsi="Microsoft YaHei"/>
-          <w:color w:val="18242E"/>
-          <w:sz w:val="20"/>
-          <w:szCs w:val="20"/>
-        </w:rPr>
-        <w:t xml:space="preserve">v18 对标签起始字符串为 unknown、unknow 或 unannotated 的记录实施预定义的审计规则：这类记录不参与身份拟合和打分，但继续计入原始公共标签规模、物种级排除数和图形分母。由无信息标签构成的物种不进入显式身份性能汇总。v17 与 v18 分别回答原始公共标签压力与显式身份迁移两个问题，不相互替代。</w:t>
+        <w:t xml:space="preserve">模型、基因迁移与输出接口</w:t>
+      </w:r>
+    </w:p>
+    <w:p>
+      <w:pPr>
+        <w:spacing w:after="125" w:line="296"/>
+        <w:jc w:val="both"/>
+      </w:pPr>
+      <w:r>
+        <w:rPr>
+          <w:rFonts w:ascii="Microsoft YaHei" w:cs="Microsoft YaHei" w:eastAsia="Microsoft YaHei" w:hAnsi="Microsoft YaHei"/>
+          <w:color w:val="18242E"/>
+          <w:sz w:val="20"/>
+          <w:szCs w:val="20"/>
+        </w:rPr>
+        <w:t xml:space="preserve">模型使用四层表达编码器产生 256 维细胞嵌入，支持 LoRA 适配和已登记适配器解析。数据输入为 cells × genes 矩阵。精确基因标识符首先与检查点词表对齐；需要跨参考基因组时，调用显式同源基因映射契约。层级注释路径、marker 候选排序和运行时元数据作为模型服务输出。模型能力、已验证范围和未完成比较在 release_metadata/plant_cellfm_model_card_v4.json 中分层记录。</w:t>
       </w:r>
     </w:p>
     <w:p>
@@ -1405,6 +1506,53 @@
           <w:sz w:val="24"/>
           <w:szCs w:val="24"/>
         </w:rPr>
+        <w:t xml:space="preserve">嵌套严格留物种评估与开放集指标</w:t>
+      </w:r>
+    </w:p>
+    <w:p>
+      <w:pPr>
+        <w:spacing w:after="125" w:line="296"/>
+        <w:jc w:val="both"/>
+      </w:pPr>
+      <w:r>
+        <w:rPr>
+          <w:rFonts w:ascii="Microsoft YaHei" w:cs="Microsoft YaHei" w:eastAsia="Microsoft YaHei" w:hAnsi="Microsoft YaHei"/>
+          <w:color w:val="18242E"/>
+          <w:sz w:val="20"/>
+          <w:szCs w:val="20"/>
+        </w:rPr>
+        <w:t xml:space="preserve">每个外层留出物种只在源物种上执行候选解码规则的内层留物种选择。最终候选规则应用于从未参与拟合或选择的目标物种。精确全细胞准确率以所有留出细胞为分母；标签覆盖率定义为目标真值标签存在于源训练标签集合中的细胞比例；条件准确率和 macro-F1 仅在可覆盖标签子集上计算。v17 同时保存候选规则排名、被选规则、逐物种汇总和逐细胞预测。</w:t>
+      </w:r>
+    </w:p>
+    <w:p>
+      <w:pPr>
+        <w:spacing w:after="125" w:line="296"/>
+        <w:jc w:val="both"/>
+      </w:pPr>
+      <w:r>
+        <w:rPr>
+          <w:rFonts w:ascii="Microsoft YaHei" w:cs="Microsoft YaHei" w:eastAsia="Microsoft YaHei" w:hAnsi="Microsoft YaHei"/>
+          <w:color w:val="18242E"/>
+          <w:sz w:val="20"/>
+          <w:szCs w:val="20"/>
+        </w:rPr>
+        <w:t xml:space="preserve">v18 对标签起始字符串为 unknown、unknow 或 unannotated 的记录实施预定义的审计规则：这类记录不参与身份拟合和打分，但继续计入原始公共标签规模、物种级排除数和图形分母。由无信息标签构成的物种不进入显式身份性能汇总。v17 与 v18 分别回答原始公共标签压力与显式身份迁移两个问题，不相互替代。</w:t>
+      </w:r>
+    </w:p>
+    <w:p>
+      <w:pPr>
+        <w:pStyle w:val="Heading2"/>
+        <w:spacing w:after="120" w:before="210"/>
+      </w:pPr>
+      <w:r>
+        <w:rPr>
+          <w:rFonts w:ascii="Microsoft YaHei" w:cs="Microsoft YaHei" w:eastAsia="Microsoft YaHei" w:hAnsi="Microsoft YaHei"/>
+          <w:b/>
+          <w:bCs/>
+          <w:color w:val="007C83"/>
+          <w:sz w:val="24"/>
+          <w:szCs w:val="24"/>
+        </w:rPr>
         <w:t xml:space="preserve">少样本适配、统计与可视化</w:t>
       </w:r>
     </w:p>
@@ -1421,6 +1569,38 @@
           <w:szCs w:val="20"/>
         </w:rPr>
         <w:t xml:space="preserve">少样本实验在每一目标物种内随机抽取固定预算的标注支持细胞，余下细胞作为查询集。支持和查询细胞按细胞 ID 强制不重叠；每个预算使用 10 个独立随机种子。图 3b,c 以均值、标准差和逐次抽样点报告结果。图 2 中对固定严格测试细胞执行非参数 bootstrap，以可视化而非替代物种级异质性。</w:t>
+      </w:r>
+    </w:p>
+    <w:p>
+      <w:pPr>
+        <w:pStyle w:val="Heading2"/>
+        <w:spacing w:after="120" w:before="210"/>
+      </w:pPr>
+      <w:r>
+        <w:rPr>
+          <w:rFonts w:ascii="Microsoft YaHei" w:cs="Microsoft YaHei" w:eastAsia="Microsoft YaHei" w:hAnsi="Microsoft YaHei"/>
+          <w:b/>
+          <w:bCs/>
+          <w:color w:val="007C83"/>
+          <w:sz w:val="24"/>
+          <w:szCs w:val="24"/>
+        </w:rPr>
+        <w:t xml:space="preserve">外部盲推理与 marker 一致性审计</w:t>
+      </w:r>
+    </w:p>
+    <w:p>
+      <w:pPr>
+        <w:spacing w:after="125" w:line="296"/>
+        <w:jc w:val="both"/>
+      </w:pPr>
+      <w:r>
+        <w:rPr>
+          <w:rFonts w:ascii="Microsoft YaHei" w:cs="Microsoft YaHei" w:eastAsia="Microsoft YaHei" w:hAnsi="Microsoft YaHei"/>
+          <w:color w:val="18242E"/>
+          <w:sz w:val="20"/>
+          <w:szCs w:val="20"/>
+        </w:rPr>
+        <w:t xml:space="preserve">GSM4626007 的原始 spliced MatrixMarket 文件经校验和记录后转换为 cells × genes H5AD 输入，并只保留 GEO 提供的细胞条形码、TAIR10 基因 ID、物种、组织、数据集和样本元数据；输入中不存在细胞身份字段。冻结注释检查点在 CUDA 上输出逐细胞 fine/coarse 标签、置信度和 256 维嵌入。对 6 个在分析前已固定的经典 marker，以原始 UMI 计数按每细胞 10,000 标准化并 log1p 转换；随后比较各 marker 在其预期预测群与所有其他预测群之间的平均表达和检出率，并报告该预期群在 13 个预测标签中的秩。外部数据集不在冻结 v4 corpus profile 中的结论只限定于该已记录 profile；本分析不据此推断任一历史上游模型从未访问过相关资源。由于没有专家真值标签，整个流程不计算准确率、macro-F1 或跨模型排名。</w:t>
       </w:r>
     </w:p>
     <w:p>
@@ -1573,6 +1753,21 @@
           <w:szCs w:val="20"/>
         </w:rPr>
         <w:t xml:space="preserve">扩展数据图 4 | 拟南芥根系候选 marker 的预定义文献锚点一致性。 a，来自根系单细胞原始文献的 6 个经典 marker 在其匹配身份 top-20 候选程序中的完整查找结果；实心点为被回收的位点，叉号为未进入存储 top-20 列表的位点。b，已回收的 CASP1、APL 与 MYB46 的检出率分离度及候选排名。该分析使用预先固定的文献锚点，支持公共数据候选资源的生物学合理性；不构成独立表达矩阵复现或湿实验验证。</w:t>
+      </w:r>
+    </w:p>
+    <w:p>
+      <w:pPr>
+        <w:spacing w:after="125" w:line="296"/>
+        <w:jc w:val="both"/>
+      </w:pPr>
+      <w:r>
+        <w:rPr>
+          <w:rFonts w:ascii="Microsoft YaHei" w:cs="Microsoft YaHei" w:eastAsia="Microsoft YaHei" w:hAnsi="Microsoft YaHei"/>
+          <w:color w:val="18242E"/>
+          <w:sz w:val="20"/>
+          <w:szCs w:val="20"/>
+        </w:rPr>
+        <w:t xml:space="preserve">扩展数据图 5 | 无标签外部拟南芥根系矩阵的盲推理与 marker 一致性。 a，GEO GSE152766 / GSM4626007 的 6,566 个细胞在冻结 256 维模型嵌入上的 UMAP；颜色为模型预测，而非输入提供的标签。b，13 个预测状态的细胞组成、平均置信度与细胞数。c，分析前固定的 6 个经典 marker 在其预期预测群相对于全部其他预测群的平均表达分离度；点大小表示该 marker 在预期群中的检出率，文字同时给出预测群细胞数和检出率分离度。该矩阵没有专家细胞类型标签，故该图为盲推理与 marker 一致性案例，不构成准确率评估、外部模型排名或独立实验验证。</w:t>
       </w:r>
     </w:p>
     <w:p>
@@ -1622,9 +1817,14 @@
         <w:t xml:space="preserve">python scripts/run_revision_v18_identity_curated_strict.py
 python scripts/run_revision_v11_fewshot_adapter_benchmark.py
 python scripts/build_v4_root_literature_concordance.py
+python scripts/download_gse152766_external_root_case.py
+python scripts/prepare_gse152766_external_root_case.py
+python scripts/audit_gse152766_external_root_case.py
 python scripts/render_v4_top_journal_figures.py
 python scripts/write_submission_v4_supplementary_tables.py
-python scripts/audit_v4_submission_figure_suite.py</w:t>
+python scripts/audit_v4_submission_figure_suite.py
+npm ci
+npm run build:manuscript</w:t>
       </w:r>
     </w:p>
     <w:p>
@@ -1792,6 +1992,21 @@
           <w:szCs w:val="20"/>
         </w:rPr>
         <w:t xml:space="preserve">Shahan, R. et al. A single cell Arabidopsis root atlas reveals developmental trajectories in wild-type and cell identity mutants. Developmental Cell 57, 543-560.e9 (2022). https://doi.org/10.1016/j.devcel.2022.01.008</w:t>
+      </w:r>
+    </w:p>
+    <w:p>
+      <w:pPr>
+        <w:spacing w:after="90" w:line="275"/>
+        <w:jc w:val="both"/>
+      </w:pPr>
+      <w:r>
+        <w:rPr>
+          <w:rFonts w:ascii="Microsoft YaHei" w:cs="Microsoft YaHei" w:eastAsia="Microsoft YaHei" w:hAnsi="Microsoft YaHei"/>
+          <w:color w:val="18242E"/>
+          <w:sz w:val="20"/>
+          <w:szCs w:val="20"/>
+        </w:rPr>
+        <w:t xml:space="preserve">NCBI Gene Expression Omnibus. Arabidopsis thaliana GSE152766, sample GSM4626007. https://www.ncbi.nlm.nih.gov/geo/query/acc.cgi?acc=GSE152766</w:t>
       </w:r>
     </w:p>
     <w:p>
@@ -2061,6 +2276,86 @@
           <w:szCs w:val="17"/>
         </w:rPr>
         <w:t xml:space="preserve">图 4 | 拟南芥根系身份与 marker 候选资源。</w:t>
+      </w:r>
+    </w:p>
+    <w:p>
+      <w:pPr>
+        <w:pStyle w:val="Heading1"/>
+        <w:spacing w:after="120" w:before="280"/>
+      </w:pPr>
+      <w:r>
+        <w:rPr>
+          <w:rFonts w:ascii="Microsoft YaHei" w:cs="Microsoft YaHei" w:eastAsia="Microsoft YaHei" w:hAnsi="Microsoft YaHei"/>
+          <w:b/>
+          <w:bCs/>
+          <w:color w:val="18242E"/>
+          <w:sz w:val="29"/>
+          <w:szCs w:val="29"/>
+        </w:rPr>
+        <w:t xml:space="preserve">关键扩展数据图</w:t>
+      </w:r>
+    </w:p>
+    <w:p>
+      <w:pPr>
+        <w:spacing w:after="70" w:before="160"/>
+        <w:jc w:val="center"/>
+      </w:pPr>
+      <w:r>
+        <w:drawing>
+          <wp:inline distT="0" distB="0" distL="0" distR="0">
+            <wp:extent cx="6000750" cy="5334000"/>
+            <wp:effectExtent t="0" r="0" b="0" l="0"/>
+            <wp:docPr id="1" name="" descr="" title=""/>
+            <wp:cNvGraphicFramePr>
+              <a:graphicFrameLocks xmlns:a="http://schemas.openxmlformats.org/drawingml/2006/main" noChangeAspect="1"/>
+            </wp:cNvGraphicFramePr>
+            <a:graphic xmlns:a="http://schemas.openxmlformats.org/drawingml/2006/main">
+              <a:graphicData uri="http://schemas.openxmlformats.org/drawingml/2006/picture">
+                <pic:pic xmlns:pic="http://schemas.openxmlformats.org/drawingml/2006/picture">
+                  <pic:nvPicPr>
+                    <pic:cNvPr id="0" name="" descr=""/>
+                    <pic:cNvPicPr>
+                      <a:picLocks noChangeAspect="1" noChangeArrowheads="1"/>
+                    </pic:cNvPicPr>
+                  </pic:nvPicPr>
+                  <pic:blipFill>
+                    <a:blip r:embed="rId12" cstate="none"/>
+                    <a:srcRect/>
+                    <a:stretch>
+                      <a:fillRect/>
+                    </a:stretch>
+                  </pic:blipFill>
+                  <pic:spPr bwMode="auto">
+                    <a:xfrm>
+                      <a:off x="0" y="0"/>
+                      <a:ext cx="6000750" cy="5334000"/>
+                    </a:xfrm>
+                    <a:prstGeom prst="rect">
+                      <a:avLst/>
+                    </a:prstGeom>
+                  </pic:spPr>
+                </pic:pic>
+              </a:graphicData>
+            </a:graphic>
+          </wp:inline>
+        </w:drawing>
+      </w:r>
+    </w:p>
+    <w:p>
+      <w:pPr>
+        <w:spacing w:after="220"/>
+        <w:jc w:val="center"/>
+      </w:pPr>
+      <w:r>
+        <w:rPr>
+          <w:rFonts w:ascii="Microsoft YaHei" w:cs="Microsoft YaHei" w:eastAsia="Microsoft YaHei" w:hAnsi="Microsoft YaHei"/>
+          <w:i/>
+          <w:iCs/>
+          <w:color w:val="60717D"/>
+          <w:sz w:val="17"/>
+          <w:szCs w:val="17"/>
+        </w:rPr>
+        <w:t xml:space="preserve">扩展数据图 5 | 无标签外部拟南芥根系矩阵的盲推理与 marker 一致性。</w:t>
       </w:r>
     </w:p>
     <w:sectPr>

</xml_diff>